<commit_message>
Variant artefact screening (positional clustering and dominant substitution class); TMB computed on screened calls with both figures reported; generate the XX395 report from the pipeline output
</commit_message>
<xml_diff>
--- a/report/BIO395_FinalReport_DRAFT.docx
+++ b/report/BIO395_FinalReport_DRAFT.docx
@@ -2191,6 +2191,34 @@
     </w:p>
     <w:p>
       <w:pPr>
+        <w:spacing w:line="480" w:lineRule="auto"/>
+        <w:ind w:firstLine="720"/>
+        <w:jc w:val="both"/>
+      </w:pPr>
+      <w:r>
+        <w:rPr>
+          <w:b w:val="0"/>
+          <w:i w:val="0"/>
+        </w:rPr>
+        <w:t>A second screening pass then examined the surviving somatic candidates as a set rather than one at a time, because two signatures of systematic error are invisible in a single variant. The first is positional clustering: several apparently independent mutations within a few tens of bases are the signature of one mis-aligned or chimeric molecule population. The second is dominance of a single substitution class, which in a highly multiplexed PCR points to cross-priming between amplicons amplified in the same reaction rather than to a mutational process.</w:t>
+      </w:r>
+    </w:p>
+    <w:p>
+      <w:pPr>
+        <w:spacing w:line="480" w:lineRule="auto"/>
+        <w:ind w:firstLine="720"/>
+        <w:jc w:val="both"/>
+      </w:pPr>
+      <w:r>
+        <w:rPr>
+          <w:b w:val="0"/>
+          <w:i w:val="0"/>
+        </w:rPr>
+        <w:t>Both signatures were present. 58 % of somatic single-nucleotide changes belonged to one substitution class (T&gt;G and its reverse complement), and four apparently independent mutations fell within thirty-five bases of one another in a single gene. In total 23 of 39 candidates carried at least one flag, leaving 16 unflagged. The flags are recorded per variant, with their reasons, rather than used to delete anything.</w:t>
+      </w:r>
+    </w:p>
+    <w:p>
+      <w:pPr>
         <w:pStyle w:val="Heading3"/>
       </w:pPr>
       <w:r>
@@ -2236,7 +2264,7 @@
           <w:b w:val="0"/>
           <w:i w:val="0"/>
         </w:rPr>
-        <w:t>Tumour mutational burden was computed as 22 non-synonymous somatic variants over 0.191 Mb of assessable territory, giving 115.18 mutations per megabase with a 95 % interval of 72.16–174.39. Section 4.6 explains why this number should not be believed, and what it reveals.</w:t>
+        <w:t>Tumour mutational burden was computed as 9 non-synonymous variants surviving artefact screening, over 0.191 Mb of assessable territory, giving 47.12 mutations per megabase with a 95 % interval of 21.5–89.45. Before screening the same calculation gave 115.18 per megabase. Section 4.6 explains why neither figure should be believed, and what that reveals.</w:t>
       </w:r>
     </w:p>
     <w:p>
@@ -3104,7 +3132,7 @@
           <w:b w:val="0"/>
           <w:i w:val="0"/>
         </w:rPr>
-        <w:t>The allele fractions agree to within 0.0, which is the single most informative number in this report: two independent workflows, using different aligners, different callers, different reference builds and different deduplication strategies, measured the same quantity in the same specimen and obtained the same answer.</w:t>
+        <w:t>The allele fractions agree to three decimal places, which is the single most informative number in this report: two independent workflows, using different aligners, different callers, different reference builds and different deduplication strategies, measured the same quantity in the same specimen and obtained the same answer.</w:t>
       </w:r>
     </w:p>
     <w:p>
@@ -3146,7 +3174,7 @@
           <w:b w:val="0"/>
           <w:i w:val="0"/>
         </w:rPr>
-        <w:t>Second, the number of candidate variants. The pipeline classified 39 variants as likely somatic where the laboratory reported one. Part of that gap is expected — the laboratory reports only variants passing its clinical thresholds and does not report Tier III or IV findings at all — but not all of it. The substitution spectrum of the additional calls is dominated by a single change and its reverse complement, which is the signature of a systematic technical artefact rather than of biology.</w:t>
+        <w:t>Second, the number of candidate variants. The pipeline classified 39 variants as likely somatic where the laboratory reported one. Part of that gap is expected — the laboratory reports only variants passing its clinical thresholds and does not report Tier III or IV findings at all — but not all of it. The substitution spectrum of the somatic candidates is dominated by one class and its reverse complement, ten of the calls sit within two hundred bases of another (four of them within a thirty-five base window in one gene), and the same mechanism — cross-priming between amplicons amplified together in a single reaction — accounts both for this and for the pseudo-fusions seen in the RNA arm, where genes primed in the same tube were joined in every possible pairwise combination. The DNA and RNA arms show one artefact with two faces.</w:t>
       </w:r>
     </w:p>
     <w:p>
@@ -3160,7 +3188,7 @@
           <w:b w:val="0"/>
           <w:i w:val="0"/>
         </w:rPr>
-        <w:t>Third, and following directly from the second, the tumour mutational burden of 115.18 mutations per megabase is not credible. Cholangiocarcinoma typically carries a few mutations per megabase. A value two orders of magnitude higher is evidence that the additional calls are artefactual, and the pipeline's own biomarker module is the instrument that reveals it. Reporting the number with its confidence interval and its caveats, rather than suppressing it, is what makes the inference possible.</w:t>
+        <w:t>Third, and following directly from the second, the tumour mutational burden is not credible. Before artefact screening it computes to 115.18 mutations per megabase; after screening, to 47.12. Cholangiocarcinoma typically carries a few mutations per megabase, so both figures remain far too high, and the assessable territory is in any case an order of magnitude below the scale at which panel mutational burden is considered interpretable. The value of the calculation here is diagnostic rather than clinical: it is the instrument that reveals the residual artefacts, and the difference between the two figures measures how much the screening removed. Reporting the number with its interval and its caveats, rather than suppressing it, is what makes that inference possible.</w:t>
       </w:r>
     </w:p>
     <w:p>
@@ -9473,7 +9501,7 @@
               <w:rPr>
                 <w:sz w:val="20"/>
               </w:rPr>
-              <w:t>2026-08-31T00:47:00+00:00</w:t>
+              <w:t>2026-08-31T00:57:17+00:00</w:t>
             </w:r>
           </w:p>
         </w:tc>
@@ -9509,7 +9537,7 @@
               <w:rPr>
                 <w:sz w:val="20"/>
               </w:rPr>
-              <w:t>19ba9d4</w:t>
+              <w:t>747a20b</w:t>
             </w:r>
           </w:p>
         </w:tc>

</xml_diff>

<commit_message>
Controlled primer-clipping comparison: clipping moves the reported variant's allele fraction from 0.2636 to 0.2814 against the laboratory's 0.281
</commit_message>
<xml_diff>
--- a/report/BIO395_FinalReport_DRAFT.docx
+++ b/report/BIO395_FinalReport_DRAFT.docx
@@ -1765,6 +1765,34 @@
           <w:i w:val="0"/>
         </w:rPr>
         <w:t>After alignment, deduplication grouped reads by barcode and position: 5,680,954 reads collapsed to 2,859,626 unique molecules, or 1.99 reads per molecule, with 2.09 distinct molecules per start position. The second number is the one that justifies the method: at a fixed amplicon start there were on average only about two distinct molecules, so coordinate-based duplicate marking would have collapsed them into one and discarded most of the evidence. The experiment is properly described as a 2.9-million-molecule measurement, not a 5.7-million-read one.</w:t>
+      </w:r>
+    </w:p>
+    <w:p>
+      <w:pPr>
+        <w:spacing w:line="480" w:lineRule="auto"/>
+        <w:ind w:firstLine="720"/>
+        <w:jc w:val="both"/>
+      </w:pPr>
+      <w:r>
+        <w:rPr>
+          <w:b w:val="0"/>
+          <w:i w:val="0"/>
+        </w:rPr>
+        <w:t>Primer-derived bases were then removed. In this chemistry the first twenty-five or so bases of Read 2 are the synthetic primer, not patient sequence, so a variant lying under a primer can be created or masked by the oligonucleotide's own sequence. The primer coordinates were obtained by aligning the primer sequences recovered in Section 4.5.2 back to the genome.</w:t>
+      </w:r>
+    </w:p>
+    <w:p>
+      <w:pPr>
+        <w:spacing w:line="480" w:lineRule="auto"/>
+        <w:ind w:firstLine="720"/>
+        <w:jc w:val="both"/>
+      </w:pPr>
+      <w:r>
+        <w:rPr>
+          <w:b w:val="0"/>
+          <w:i w:val="0"/>
+        </w:rPr>
+        <w:t>The effect was measured rather than assumed, by running the same three callers with the same filters over the alignment twice, with and without clipping. Clipping reduced the merged call set from 2,045 positions to 1,718 and the somatic candidates from 48 to 39. More informative than either count is what it did to the one variant whose true value is known independently: the reported IDH1 allele fraction moved from 0.2636 without clipping to 0.2814 with it, against the laboratory's 0.281. Primer bases do not merely add spurious calls, they bias the allele fraction of a real one, and removing them moved the estimate from 1.7 percentage points away from the accredited value to four ten-thousandths away from it.</w:t>
       </w:r>
     </w:p>
     <w:p>

</xml_diff>

<commit_message>
Audit the report against the faculty guidelines and fix what failed: running head, table cross-references, uncited references, table decimals, results-section length
</commit_message>
<xml_diff>
--- a/report/BIO395_FinalReport_DRAFT.docx
+++ b/report/BIO395_FinalReport_DRAFT.docx
@@ -572,7 +572,7 @@
           <w:b w:val="0"/>
           <w:i w:val="0"/>
         </w:rPr>
-        <w:t>Formalin fixation deaminates cytosine and produces characteristic C&gt;T and G&gt;A changes at low allele fraction (Do and Dobrovic, 2015). Diossy et al. (2021) show that strand-orientation scoring identifies such artefacts, and — importantly for how results are presented — argue that when an individual targetable mutation is at stake the artefact probability should be reported alongside the call rather than used to delete it.</w:t>
+        <w:t>Formalin fixation deaminates cytosine and produces characteristic C&gt;T and G&gt;A changes at low allele fraction (Do and Dobrovic, 2015). Díossy et al. (2021) show that strand-orientation scoring identifies such artefacts, and — importantly for how results are presented — argue that when an individual targetable mutation is at stake the artefact probability should be reported alongside the call rather than used to delete it.</w:t>
       </w:r>
     </w:p>
     <w:p>
@@ -586,7 +586,7 @@
           <w:b w:val="0"/>
           <w:i w:val="0"/>
         </w:rPr>
-        <w:t>Clinical interpretation follows two complementary systems. Li et al. (2017), the joint AMP/ASCO/CAP recommendation, sorts variants into four tiers by strength of clinical evidence, with Tier I reserved for an approved therapy or professional guideline in the patient's own tumour type. Mateo et al. (2018) propose ESCAT, which instead asks how ready a target is for routine use. The two disagree by design, and the pipeline reports both.</w:t>
+        <w:t>Clinical interpretation follows two complementary systems. Li et al. (2017), the joint AMP/ASCO/CAP recommendation, sorts variants into four tiers by strength of clinical evidence, with Tier I reserved for an approved therapy or professional guideline in the patient's own tumour type. Mateo et al. (2018) propose ESCAT, which instead asks how ready a target is for routine use. The two disagree by design, and the pipeline reports both. The evidence behind those tiers comes from curated knowledge bases: CIViC (Griffith et al., 2017), which is released under a public-domain licence and can therefore be redistributed, and OncoKB (Chakravarty et al., 2017), which is free for academic use but whose annotations may not be republished. Nakken et al. (2018) show what an integrated open interpretation report of this kind looks like in practice, and their Personal Cancer Genome Reporter was the model for the output produced here.</w:t>
       </w:r>
     </w:p>
     <w:p>
@@ -827,7 +827,7 @@
           <w:b w:val="0"/>
           <w:i w:val="0"/>
         </w:rPr>
-        <w:t>The pipeline is a Snakemake workflow with two execution modes. In patient mode the memory-intensive steps run on the public Galaxy service at usegalaxy.eu and the interpretation runs locally; in example mode everything runs locally on a synthetic dataset built over a small extract of the real human reference, which is what continuous integration executes. The split exists for a concrete reason: aligning to the human genome needs roughly 6 GB of RAM for BWA and about 31 GB for STAR, while the machine available had 8 GB.</w:t>
+        <w:t>The pipeline is a Snakemake workflow with two execution modes. In patient mode the memory-intensive steps run on the public Galaxy service at usegalaxy.eu and the interpretation runs locally; in example mode everything runs locally on a synthetic dataset built over a small extract of the real human reference, which is what continuous integration executes. The split exists for a concrete reason: aligning to the human genome needs roughly 6 GB of RAM for BWA and about 31 GB for STAR, while the machine available had 8 GB. Table 1 lists the stages and where each executes.</w:t>
       </w:r>
     </w:p>
     <w:p>
@@ -1836,7 +1836,7 @@
           <w:b w:val="0"/>
           <w:i w:val="0"/>
         </w:rPr>
-        <w:t>Three independent callers were run over the same alignment: Mutect2 in tumour-only mode with the gnomAD population resource, LoFreq, and FreeBayes. They produced 575, 1,039 and 340 records respectively, merging to 1,718 distinct positions.</w:t>
+        <w:t>Three independent callers were run over the same alignment: Mutect2 in tumour-only mode with the gnomAD population resource, LoFreq, and FreeBayes. They produced 575, 1,039 and 340 records respectively, merging to 1,718 distinct positions. Their agreement is summarised in Table 2.</w:t>
       </w:r>
     </w:p>
     <w:p>
@@ -2039,7 +2039,7 @@
           <w:b w:val="0"/>
           <w:i w:val="0"/>
         </w:rPr>
-        <w:t>Variants surviving that filter were then classified. A variant present in gnomAD above 0.1 % is recorded as likely germline; so is a heterozygous variant with a dbSNP identifier and an unambiguously benign ClinVar record. The word unambiguously matters, and cost a bug: the annotation service aggregates the significance of every ClinVar record at a position, so a mixed string such as "benign, pathogenic" must not be read as benign. Variants that are heterozygous, rare and pathogenic in a cancer-predisposition gene are flagged as unresolvable rather than assigned, because a tumour-only assay genuinely cannot decide and an inherited finding has consequences beyond the patient.</w:t>
+        <w:t>Variants surviving that filter were then classified. A variant present in gnomAD above 0.1 % is recorded as likely germline; so is a heterozygous variant with a dbSNP identifier and an unambiguously benign ClinVar record. The word unambiguously matters, and cost a bug: the annotation service aggregates the significance of every ClinVar record at a position, so a mixed string such as "benign, pathogenic" must not be read as benign. Variants that are heterozygous, rare and pathogenic in a cancer-predisposition gene are flagged as unresolvable rather than assigned, because a tumour-only assay genuinely cannot decide and an inherited finding has consequences beyond the patient. Table 3 gives the resulting classification.</w:t>
       </w:r>
     </w:p>
     <w:p>
@@ -2247,6 +2247,20 @@
     </w:p>
     <w:p>
       <w:pPr>
+        <w:spacing w:line="480" w:lineRule="auto"/>
+        <w:ind w:firstLine="720"/>
+        <w:jc w:val="both"/>
+      </w:pPr>
+      <w:r>
+        <w:rPr>
+          <w:b w:val="0"/>
+          <w:i w:val="0"/>
+        </w:rPr>
+        <w:t>Three observations identify the mechanism behind those flags, and they point the same way. The substitution spectrum of the somatic candidates is dominated by one class and its reverse complement. Ten of the calls sit within two hundred bases of another, four of them inside a thirty-five base window in a single gene, which is not a pattern independent mutational events produce. And the same explanation — cross-priming between amplicons amplified together in one reaction, generating chimeric molecules whose mismatches are carried in the reads themselves — accounts both for this and for the pseudo-fusions described in Section 4.5.7, where genes primed in the same tube were joined in every possible pairwise combination. The DNA and RNA arms show one artefact with two faces.</w:t>
+      </w:r>
+    </w:p>
+    <w:p>
+      <w:pPr>
         <w:pStyle w:val="Heading3"/>
       </w:pPr>
       <w:r>
@@ -2306,6 +2320,20 @@
           <w:b w:val="0"/>
           <w:i w:val="0"/>
         </w:rPr>
+        <w:t>Tumour mutational burden was reported with an explicit confidence interval because panel-based estimates are not portable between assays: the Friends of Cancer Research harmonisation study (Merino et al., 2020) showed that the same tumour yields materially different values on different panels, so a bare number invites a comparison it cannot support.</w:t>
+      </w:r>
+    </w:p>
+    <w:p>
+      <w:pPr>
+        <w:spacing w:line="480" w:lineRule="auto"/>
+        <w:ind w:firstLine="720"/>
+        <w:jc w:val="both"/>
+      </w:pPr>
+      <w:r>
+        <w:rPr>
+          <w:b w:val="0"/>
+          <w:i w:val="0"/>
+        </w:rPr>
         <w:t>Microsatellite instability and mutational signatures were deliberately not computed. Normal-free microsatellite calling needs a panel-specific model or a baseline built from at least twenty normal samples; signature fitting needs on the order of one to two hundred mutations. Neither condition holds. Reporting either number would have been unfalsifiable, and the accredited laboratory also reported that microsatellite status could not be calculated.</w:t>
       </w:r>
     </w:p>
@@ -2328,7 +2356,7 @@
           <w:b w:val="0"/>
           <w:i w:val="0"/>
         </w:rPr>
-        <w:t>RNA reads were aligned with STAR using the parameter preset the fusion caller expects, then screened with Arriba. The alignment statistics look alarming at first sight — 21.47 % uniquely mapped and 75.76 % classified as chimeric — but this is a property of the chemistry rather than of the tumour. Read 1 begins at an arbitrary ligation point, Read 2 at a fixed primer, inserts are short, and the caller's preset sets a deliberately permissive chimeric threshold.</w:t>
+        <w:t>RNA reads were aligned with STAR using the parameter preset the fusion caller expects, then screened with Arriba. The alignment statistics look alarming at first sight — 21.47 % uniquely mapped and 75.76 % classified as chimeric — but this is a property of the chemistry rather than of the tumour. Read 1 begins at an arbitrary ligation point, Read 2 at a fixed primer, inserts are short, and the caller's preset sets a deliberately permissive chimeric threshold. The genes involved were then mapped onto the canonical oncogenic pathways curated by Sanchez-Vega et al. (2018), reported in Appendix B as membership rather than enrichment, since the gene universe is fixed by the assay.</w:t>
       </w:r>
     </w:p>
     <w:p>
@@ -2668,7 +2696,7 @@
           <w:b w:val="0"/>
           <w:i w:val="0"/>
         </w:rPr>
-        <w:t>MET exon 14 skipping is explicitly within the assay's scope and is targetable by approved inhibitors. It was not detected, and the negative is meaningful rather than empty: the canonical junctions flanking the exon carried thousands of reads, so the region was well covered and the event would have been visible had it been present.</w:t>
+        <w:t>MET exon 14 skipping is explicitly within the assay's scope and is targetable by approved inhibitors. As Table 4 shows, it was not detected, and the negative is meaningful rather than empty: the canonical junctions flanking the exon carried thousands of reads, so the region was well covered and the event would have been visible had it been present.</w:t>
       </w:r>
     </w:p>
     <w:p>
@@ -2690,7 +2718,7 @@
           <w:b w:val="0"/>
           <w:i w:val="0"/>
         </w:rPr>
-        <w:t>The pipeline ran to completion on the patient specimen. Against the accredited laboratory's report it recovered 1 of 1 reported variants and missed 0.</w:t>
+        <w:t>The pipeline ran to completion on the patient specimen, recovering 1 of the 1 variants the accredited laboratory reported and missing 0 (Table 5).</w:t>
       </w:r>
     </w:p>
     <w:p>
@@ -2703,7 +2731,7 @@
           <w:b/>
           <w:sz w:val="22"/>
         </w:rPr>
-        <w:t>Table 5. The reported finding, as determined independently by the two workflows.</w:t>
+        <w:t>Table 5. The reported finding, as determined independently by the two workflows. Allele fractions are given to four decimal places here because the agreement at that precision is itself the result; elsewhere two decimals are used.</w:t>
       </w:r>
     </w:p>
     <w:tbl>
@@ -3160,12 +3188,12 @@
           <w:b w:val="0"/>
           <w:i w:val="0"/>
         </w:rPr>
-        <w:t>The allele fractions agree to three decimal places, which is the single most informative number in this report: two independent workflows, using different aligners, different callers, different reference builds and different deduplication strategies, measured the same quantity in the same specimen and obtained the same answer.</w:t>
+        <w:t>The allele fractions agree to three decimal places. That is the single most informative result here: two independent workflows, with different aligners, callers, reference builds and deduplication strategies, measured the same quantity in the same specimen and agreed.</w:t>
       </w:r>
     </w:p>
     <w:p>
       <w:pPr>
-        <w:spacing w:line="360" w:lineRule="auto"/>
+        <w:spacing w:line="480" w:lineRule="auto"/>
         <w:ind w:firstLine="720"/>
         <w:jc w:val="both"/>
       </w:pPr>
@@ -3174,7 +3202,7 @@
           <w:b w:val="0"/>
           <w:i w:val="0"/>
         </w:rPr>
-        <w:t>Three differences remain, and each is informative.</w:t>
+        <w:t>Three differences remain, and each is informative. First, clinical tier: the laboratory assigned Tier I-A, this pipeline II. Both are defensible. The laboratory cited the NCCN Biliary Tract guideline, which records an approved therapy for this alteration in this tumour type, whereas the open knowledge bases available here hold level-A evidence for the same variant only in other tumour types, and the tiering rule correctly refuses Tier I on evidence from a different disease. The gap measures the uneven tumour-type coverage of open evidence sources rather than any disagreement about biology, and it is this project's clearest argument for why automated tiering needs curated commercial knowledge or expert review.</w:t>
       </w:r>
     </w:p>
     <w:p>
@@ -3188,7 +3216,7 @@
           <w:b w:val="0"/>
           <w:i w:val="0"/>
         </w:rPr>
-        <w:t>First, clinical tier. The laboratory assigned Tier I-A; this pipeline assigns II. Both are defensible. The laboratory cited the NCCN Biliary Tract guideline, which records an approved therapy for this alteration in this tumour type. The free knowledge bases available here hold level-A evidence for the same variant only in other tumour types, and the tiering rule correctly refuses to award Tier I on evidence from a different disease. The gap is not a disagreement about biology; it measures the uneven tumour-type coverage of open evidence sources, and it is the clearest argument in this project for why automated tiering requires either curated commercial knowledge or expert review.</w:t>
+        <w:t>Second, the pipeline classified 39 variants as likely somatic where the laboratory reported one. Part of that gap is expected, since the laboratory reports only variants passing its clinical thresholds and does not report Tier III or IV findings at all; the remainder is technical, and the evidence for that is set out in Section 4.5.5. Third, and following from it, the tumour mutational burden is not credible at either 115.18 or 47.12 mutations per megabase, against the few per megabase typical of this tumour type. Its value here is diagnostic rather than clinical: it is the instrument that reveals the residual artefacts.</w:t>
       </w:r>
     </w:p>
     <w:p>
@@ -3202,35 +3230,7 @@
           <w:b w:val="0"/>
           <w:i w:val="0"/>
         </w:rPr>
-        <w:t>Second, the number of candidate variants. The pipeline classified 39 variants as likely somatic where the laboratory reported one. Part of that gap is expected — the laboratory reports only variants passing its clinical thresholds and does not report Tier III or IV findings at all — but not all of it. The substitution spectrum of the somatic candidates is dominated by one class and its reverse complement, ten of the calls sit within two hundred bases of another (four of them within a thirty-five base window in one gene), and the same mechanism — cross-priming between amplicons amplified together in a single reaction — accounts both for this and for the pseudo-fusions seen in the RNA arm, where genes primed in the same tube were joined in every possible pairwise combination. The DNA and RNA arms show one artefact with two faces.</w:t>
-      </w:r>
-    </w:p>
-    <w:p>
-      <w:pPr>
-        <w:spacing w:line="480" w:lineRule="auto"/>
-        <w:ind w:firstLine="720"/>
-        <w:jc w:val="both"/>
-      </w:pPr>
-      <w:r>
-        <w:rPr>
-          <w:b w:val="0"/>
-          <w:i w:val="0"/>
-        </w:rPr>
-        <w:t>Third, and following directly from the second, the tumour mutational burden is not credible. Before artefact screening it computes to 115.18 mutations per megabase; after screening, to 47.12. Cholangiocarcinoma typically carries a few mutations per megabase, so both figures remain far too high, and the assessable territory is in any case an order of magnitude below the scale at which panel mutational burden is considered interpretable. The value of the calculation here is diagnostic rather than clinical: it is the instrument that reveals the residual artefacts, and the difference between the two figures measures how much the screening removed. Reporting the number with its interval and its caveats, rather than suppressing it, is what makes that inference possible.</w:t>
-      </w:r>
-    </w:p>
-    <w:p>
-      <w:pPr>
-        <w:spacing w:line="480" w:lineRule="auto"/>
-        <w:ind w:firstLine="720"/>
-        <w:jc w:val="both"/>
-      </w:pPr>
-      <w:r>
-        <w:rPr>
-          <w:b w:val="0"/>
-          <w:i w:val="0"/>
-        </w:rPr>
-        <w:t>On the RNA side the two workflows agree on a negative: the laboratory reported no fusion, and after artefact screening this pipeline reports none either, with the reasoning recorded for each of the candidate calls. Microsatellite status was not determined by either workflow, for the same reason.</w:t>
+        <w:t>On the RNA side the two workflows agree on a negative: the laboratory reported no fusion and, after artefact screening, neither does this pipeline, with the reasoning recorded per call. Neither workflow could determine microsatellite status.</w:t>
       </w:r>
     </w:p>
     <w:p>
@@ -3790,6 +3790,20 @@
       </w:pPr>
       <w:r>
         <w:t>Appendix A. Alterations classified as likely somatic</w:t>
+      </w:r>
+    </w:p>
+    <w:p>
+      <w:pPr>
+        <w:spacing w:line="480" w:lineRule="auto"/>
+        <w:ind w:firstLine="720"/>
+        <w:jc w:val="both"/>
+      </w:pPr>
+      <w:r>
+        <w:rPr>
+          <w:b w:val="0"/>
+          <w:i w:val="0"/>
+        </w:rPr>
+        <w:t>Table A1 lists every alteration classified as likely somatic, with its tier assignment.</w:t>
       </w:r>
     </w:p>
     <w:p>
@@ -4047,7 +4061,7 @@
               <w:rPr>
                 <w:sz w:val="20"/>
               </w:rPr>
-              <w:t>0.2814</w:t>
+              <w:t>0.28</w:t>
             </w:r>
           </w:p>
         </w:tc>
@@ -4167,7 +4181,7 @@
               <w:rPr>
                 <w:sz w:val="20"/>
               </w:rPr>
-              <w:t>0.5232</w:t>
+              <w:t>0.52</w:t>
             </w:r>
           </w:p>
         </w:tc>
@@ -4288,7 +4302,7 @@
               <w:rPr>
                 <w:sz w:val="20"/>
               </w:rPr>
-              <w:t>0.2398</w:t>
+              <w:t>0.24</w:t>
             </w:r>
           </w:p>
         </w:tc>
@@ -4409,7 +4423,7 @@
               <w:rPr>
                 <w:sz w:val="20"/>
               </w:rPr>
-              <w:t>0.218</w:t>
+              <w:t>0.22</w:t>
             </w:r>
           </w:p>
         </w:tc>
@@ -4530,7 +4544,7 @@
               <w:rPr>
                 <w:sz w:val="20"/>
               </w:rPr>
-              <w:t>0.1978</w:t>
+              <w:t>0.20</w:t>
             </w:r>
           </w:p>
         </w:tc>
@@ -4771,7 +4785,7 @@
               <w:rPr>
                 <w:sz w:val="20"/>
               </w:rPr>
-              <w:t>0.1598</w:t>
+              <w:t>0.16</w:t>
             </w:r>
           </w:p>
         </w:tc>
@@ -4892,7 +4906,7 @@
               <w:rPr>
                 <w:sz w:val="20"/>
               </w:rPr>
-              <w:t>0.1594</w:t>
+              <w:t>0.16</w:t>
             </w:r>
           </w:p>
         </w:tc>
@@ -5013,7 +5027,7 @@
               <w:rPr>
                 <w:sz w:val="20"/>
               </w:rPr>
-              <w:t>0.1565</w:t>
+              <w:t>0.16</w:t>
             </w:r>
           </w:p>
         </w:tc>
@@ -5133,7 +5147,7 @@
               <w:rPr>
                 <w:sz w:val="20"/>
               </w:rPr>
-              <w:t>0.1477</w:t>
+              <w:t>0.15</w:t>
             </w:r>
           </w:p>
         </w:tc>
@@ -5253,7 +5267,7 @@
               <w:rPr>
                 <w:sz w:val="20"/>
               </w:rPr>
-              <w:t>0.1435</w:t>
+              <w:t>0.14</w:t>
             </w:r>
           </w:p>
         </w:tc>
@@ -5374,7 +5388,7 @@
               <w:rPr>
                 <w:sz w:val="20"/>
               </w:rPr>
-              <w:t>0.1351</w:t>
+              <w:t>0.14</w:t>
             </w:r>
           </w:p>
         </w:tc>
@@ -5495,7 +5509,7 @@
               <w:rPr>
                 <w:sz w:val="20"/>
               </w:rPr>
-              <w:t>0.1268</w:t>
+              <w:t>0.13</w:t>
             </w:r>
           </w:p>
         </w:tc>
@@ -5615,7 +5629,7 @@
               <w:rPr>
                 <w:sz w:val="20"/>
               </w:rPr>
-              <w:t>0.1253</w:t>
+              <w:t>0.13</w:t>
             </w:r>
           </w:p>
         </w:tc>
@@ -5736,7 +5750,7 @@
               <w:rPr>
                 <w:sz w:val="20"/>
               </w:rPr>
-              <w:t>0.1197</w:t>
+              <w:t>0.12</w:t>
             </w:r>
           </w:p>
         </w:tc>
@@ -5857,7 +5871,7 @@
               <w:rPr>
                 <w:sz w:val="20"/>
               </w:rPr>
-              <w:t>0.1148</w:t>
+              <w:t>0.11</w:t>
             </w:r>
           </w:p>
         </w:tc>
@@ -5978,7 +5992,7 @@
               <w:rPr>
                 <w:sz w:val="20"/>
               </w:rPr>
-              <w:t>0.1107</w:t>
+              <w:t>0.11</w:t>
             </w:r>
           </w:p>
         </w:tc>
@@ -6099,7 +6113,7 @@
               <w:rPr>
                 <w:sz w:val="20"/>
               </w:rPr>
-              <w:t>0.1062</w:t>
+              <w:t>0.11</w:t>
             </w:r>
           </w:p>
         </w:tc>
@@ -6220,7 +6234,7 @@
               <w:rPr>
                 <w:sz w:val="20"/>
               </w:rPr>
-              <w:t>0.0927</w:t>
+              <w:t>0.09</w:t>
             </w:r>
           </w:p>
         </w:tc>
@@ -6340,7 +6354,7 @@
               <w:rPr>
                 <w:sz w:val="20"/>
               </w:rPr>
-              <w:t>0.0895</w:t>
+              <w:t>0.09</w:t>
             </w:r>
           </w:p>
         </w:tc>
@@ -6461,7 +6475,7 @@
               <w:rPr>
                 <w:sz w:val="20"/>
               </w:rPr>
-              <w:t>0.0895</w:t>
+              <w:t>0.09</w:t>
             </w:r>
           </w:p>
         </w:tc>
@@ -6582,7 +6596,7 @@
               <w:rPr>
                 <w:sz w:val="20"/>
               </w:rPr>
-              <w:t>0.0867</w:t>
+              <w:t>0.09</w:t>
             </w:r>
           </w:p>
         </w:tc>
@@ -6703,7 +6717,7 @@
               <w:rPr>
                 <w:sz w:val="20"/>
               </w:rPr>
-              <w:t>0.0859</w:t>
+              <w:t>0.09</w:t>
             </w:r>
           </w:p>
         </w:tc>
@@ -6824,7 +6838,7 @@
               <w:rPr>
                 <w:sz w:val="20"/>
               </w:rPr>
-              <w:t>0.0853</w:t>
+              <w:t>0.09</w:t>
             </w:r>
           </w:p>
         </w:tc>
@@ -6945,7 +6959,7 @@
               <w:rPr>
                 <w:sz w:val="20"/>
               </w:rPr>
-              <w:t>0.0789</w:t>
+              <w:t>0.08</w:t>
             </w:r>
           </w:p>
         </w:tc>
@@ -7066,7 +7080,7 @@
               <w:rPr>
                 <w:sz w:val="20"/>
               </w:rPr>
-              <w:t>0.0774</w:t>
+              <w:t>0.08</w:t>
             </w:r>
           </w:p>
         </w:tc>
@@ -7186,7 +7200,7 @@
               <w:rPr>
                 <w:sz w:val="20"/>
               </w:rPr>
-              <w:t>0.0772</w:t>
+              <w:t>0.08</w:t>
             </w:r>
           </w:p>
         </w:tc>
@@ -7306,7 +7320,7 @@
               <w:rPr>
                 <w:sz w:val="20"/>
               </w:rPr>
-              <w:t>0.0747</w:t>
+              <w:t>0.07</w:t>
             </w:r>
           </w:p>
         </w:tc>
@@ -7426,7 +7440,7 @@
               <w:rPr>
                 <w:sz w:val="20"/>
               </w:rPr>
-              <w:t>0.0732</w:t>
+              <w:t>0.07</w:t>
             </w:r>
           </w:p>
         </w:tc>
@@ -7547,7 +7561,7 @@
               <w:rPr>
                 <w:sz w:val="20"/>
               </w:rPr>
-              <w:t>0.0717</w:t>
+              <w:t>0.07</w:t>
             </w:r>
           </w:p>
         </w:tc>
@@ -7668,7 +7682,7 @@
               <w:rPr>
                 <w:sz w:val="20"/>
               </w:rPr>
-              <w:t>0.0716</w:t>
+              <w:t>0.07</w:t>
             </w:r>
           </w:p>
         </w:tc>
@@ -7789,7 +7803,7 @@
               <w:rPr>
                 <w:sz w:val="20"/>
               </w:rPr>
-              <w:t>0.0562</w:t>
+              <w:t>0.06</w:t>
             </w:r>
           </w:p>
         </w:tc>
@@ -7909,7 +7923,7 @@
               <w:rPr>
                 <w:sz w:val="20"/>
               </w:rPr>
-              <w:t>0.0555</w:t>
+              <w:t>0.06</w:t>
             </w:r>
           </w:p>
         </w:tc>
@@ -8030,7 +8044,7 @@
               <w:rPr>
                 <w:sz w:val="20"/>
               </w:rPr>
-              <w:t>0.051</w:t>
+              <w:t>0.05</w:t>
             </w:r>
           </w:p>
         </w:tc>
@@ -8150,7 +8164,7 @@
               <w:rPr>
                 <w:sz w:val="20"/>
               </w:rPr>
-              <w:t>0.1138</w:t>
+              <w:t>0.11</w:t>
             </w:r>
           </w:p>
         </w:tc>
@@ -8271,7 +8285,7 @@
               <w:rPr>
                 <w:sz w:val="20"/>
               </w:rPr>
-              <w:t>0.103</w:t>
+              <w:t>0.10</w:t>
             </w:r>
           </w:p>
         </w:tc>
@@ -8391,7 +8405,7 @@
               <w:rPr>
                 <w:sz w:val="20"/>
               </w:rPr>
-              <w:t>0.0994</w:t>
+              <w:t>0.10</w:t>
             </w:r>
           </w:p>
         </w:tc>
@@ -8511,7 +8525,7 @@
               <w:rPr>
                 <w:sz w:val="20"/>
               </w:rPr>
-              <w:t>0.0988</w:t>
+              <w:t>0.10</w:t>
             </w:r>
           </w:p>
         </w:tc>
@@ -8632,7 +8646,7 @@
               <w:rPr>
                 <w:sz w:val="20"/>
               </w:rPr>
-              <w:t>0.0316</w:t>
+              <w:t>0.03</w:t>
             </w:r>
           </w:p>
         </w:tc>
@@ -8666,6 +8680,20 @@
       </w:pPr>
       <w:r>
         <w:t>Appendix B. Oncogenic pathway membership</w:t>
+      </w:r>
+    </w:p>
+    <w:p>
+      <w:pPr>
+        <w:spacing w:line="480" w:lineRule="auto"/>
+        <w:ind w:firstLine="720"/>
+        <w:jc w:val="both"/>
+      </w:pPr>
+      <w:r>
+        <w:rPr>
+          <w:b w:val="0"/>
+          <w:i w:val="0"/>
+        </w:rPr>
+        <w:t>Table B1 maps the altered genes onto the canonical oncogenic pathways.</w:t>
       </w:r>
     </w:p>
     <w:p>
@@ -9439,6 +9467,20 @@
     </w:p>
     <w:p>
       <w:pPr>
+        <w:spacing w:line="480" w:lineRule="auto"/>
+        <w:ind w:firstLine="720"/>
+        <w:jc w:val="both"/>
+      </w:pPr>
+      <w:r>
+        <w:rPr>
+          <w:b w:val="0"/>
+          <w:i w:val="0"/>
+        </w:rPr>
+        <w:t>Table C1 records the provenance of the analysis reported here.</w:t>
+      </w:r>
+    </w:p>
+    <w:p>
+      <w:pPr>
         <w:spacing w:line="240" w:lineRule="auto"/>
         <w:jc w:val="center"/>
       </w:pPr>
@@ -9686,6 +9728,7 @@
     </w:p>
     <w:sectPr>
       <w:footerReference w:type="default" r:id="rId9"/>
+      <w:headerReference w:type="default" r:id="rId10"/>
       <w:pgSz w:w="12240" w:h="15840"/>
       <w:pgMar w:top="1440" w:right="1440" w:bottom="1440" w:left="1440" w:header="720" w:footer="720" w:gutter="0"/>
       <w:cols w:space="720"/>
@@ -9709,6 +9752,25 @@
     </w:r>
   </w:p>
 </w:ftr>
+</file>
+
+<file path=word/header1.xml><?xml version="1.0" encoding="utf-8"?>
+<w:hdr xmlns:m="http://schemas.openxmlformats.org/officeDocument/2006/math" xmlns:mc="http://schemas.openxmlformats.org/markup-compatibility/2006" xmlns:mo="http://schemas.microsoft.com/office/mac/office/2008/main" xmlns:mv="urn:schemas-microsoft-com:mac:vml" xmlns:o="urn:schemas-microsoft-com:office:office" xmlns:r="http://schemas.openxmlformats.org/officeDocument/2006/relationships" xmlns:v="urn:schemas-microsoft-com:vml" xmlns:w10="urn:schemas-microsoft-com:office:word" xmlns:w14="http://schemas.microsoft.com/office/word/2010/wordml" xmlns:w="http://schemas.openxmlformats.org/wordprocessingml/2006/main" xmlns:wne="http://schemas.microsoft.com/office/word/2006/wordml" xmlns:wp14="http://schemas.microsoft.com/office/word/2010/wordprocessingDrawing" xmlns:wp="http://schemas.openxmlformats.org/drawingml/2006/wordprocessingDrawing" xmlns:wpc="http://schemas.microsoft.com/office/word/2010/wordprocessingCanvas" xmlns:wpg="http://schemas.microsoft.com/office/word/2010/wordprocessingGroup" xmlns:wpi="http://schemas.microsoft.com/office/word/2010/wordprocessingInk" xmlns:wps="http://schemas.microsoft.com/office/word/2010/wordprocessingShape" mc:Ignorable="w14 wp14">
+  <w:p>
+    <w:pPr>
+      <w:pStyle w:val="Header"/>
+      <w:spacing w:line="240" w:lineRule="auto"/>
+      <w:jc w:val="right"/>
+    </w:pPr>
+    <w:r>
+      <w:rPr>
+        <w:rFonts w:ascii="Times New Roman" w:hAnsi="Times New Roman"/>
+        <w:sz w:val="20"/>
+      </w:rPr>
+      <w:t>DNA–RNA TUMOUR PROFILING PIPELINE</w:t>
+    </w:r>
+  </w:p>
+</w:hdr>
 </file>
 
 <file path=word/numbering.xml><?xml version="1.0" encoding="utf-8"?>

</xml_diff>